<commit_message>
Use first person singular and complete declarations
</commit_message>
<xml_diff>
--- a/output/report/manuscript.docx
+++ b/output/report/manuscript.docx
@@ -62,7 +62,7 @@
           <w:szCs w:val="21"/>
           <w:color w:val="000000"/>
         </w:rPr>
-        <w:t xml:space="preserve">[Affiliation: to be confirmed by author]</w:t>
+        <w:t xml:space="preserve">Independent researcher</w:t>
       </w:r>
     </w:p>
     <w:p>
@@ -125,7 +125,7 @@
           <w:szCs w:val="21"/>
           <w:color w:val="000000"/>
         </w:rPr>
-        <w:t xml:space="preserve">Background: Sex differences in the association between body mass index (BMI) and cardiometabolic disease are usually reported as ratios of odds ratios. Interaction on the additive scale, which reflects absolute excess burden and is more relevant to public health targeting, has not been reported for cardiometabolic multimorbidity in Canadian adults. We estimated sex differences in the association between BMI category and cardiometabolic multimorbidity on both scales.</w:t>
+        <w:t xml:space="preserve">Background: Sex differences in the association between body mass index (BMI) and cardiometabolic disease are usually reported as ratios of odds ratios. Interaction on the additive scale, which reflects absolute excess burden and is more relevant to public health targeting, has not been reported for cardiometabolic multimorbidity in Canadian adults. I estimated sex differences in the association between BMI category and cardiometabolic multimorbidity on both scales.</w:t>
       </w:r>
     </w:p>
     <w:p>
@@ -143,7 +143,7 @@
           <w:szCs w:val="21"/>
           <w:color w:val="000000"/>
         </w:rPr>
-        <w:t xml:space="preserve">Methods: Cross-sectional analysis of the Canadian Community Health Survey 2017-2018 Public Use Microdata File (104,611 adults). Multimorbidity was two or more of self-reported hypertension, diabetes and heart disease. BMI was self-reported and adjusted for reporting bias. We fitted survey-weighted logistic regression with a sex by BMI interaction, adjusted for age, income, education, smoking, alcohol and physical activity, using bootstrap replicate weights and 20 multiple imputations. Additive interaction was estimated as the relative excess risk due to interaction (RERI) and as model-standardized prevalence differences.</w:t>
+        <w:t xml:space="preserve">Methods: Cross-sectional analysis of the Canadian Community Health Survey 2017-2018 Public Use Microdata File (104,611 adults). Multimorbidity was two or more of self-reported hypertension, diabetes and heart disease. BMI was self-reported and adjusted for reporting bias. I fitted survey-weighted logistic regression with a sex by BMI interaction, adjusted for age, income, education, smoking, alcohol and physical activity, using bootstrap replicate weights and 20 multiple imputations. Additive interaction was estimated as the relative excess risk due to interaction (RERI) and as model-standardized prevalence differences.</w:t>
       </w:r>
     </w:p>
     <w:p>
@@ -242,7 +242,7 @@
           <w:szCs w:val="21"/>
           <w:color w:val="000000"/>
         </w:rPr>
-        <w:t xml:space="preserve">When studies ask whether the association between BMI and cardiometabolic disease differs between women and men, they usually compare odds ratios, that is, they test for interaction on the multiplicative scale. Interaction on the additive scale asks a different question: whether the absolute excess burden associated with a risk factor differs between groups. Because women and men differ in their baseline prevalence of cardiometabolic disease, the two scales can disagree, and the additive scale is the one that bears on where the largest number of excess cases occurs [10,11]. Additive interaction between obesity and sex has been examined for arthritis in the CCHS [12] and for the accumulation of chronic conditions in a United States cohort [13], but, to our knowledge, it has not been reported for cardiometabolic multimorbidity in Canadian adults.</w:t>
+        <w:t xml:space="preserve">When studies ask whether the association between BMI and cardiometabolic disease differs between women and men, they usually compare odds ratios, that is, they test for interaction on the multiplicative scale. Interaction on the additive scale asks a different question: whether the absolute excess burden associated with a risk factor differs between groups. Because women and men differ in their baseline prevalence of cardiometabolic disease, the two scales can disagree, and the additive scale is the one that bears on where the largest number of excess cases occurs [10,11]. Additive interaction between obesity and sex has been examined for arthritis in the CCHS [12] and for the accumulation of chronic conditions in a United States cohort [13], but, to my knowledge, it has not been reported for cardiometabolic multimorbidity in Canadian adults.</w:t>
       </w:r>
     </w:p>
     <w:p>
@@ -260,7 +260,7 @@
           <w:szCs w:val="21"/>
           <w:color w:val="000000"/>
         </w:rPr>
-        <w:t xml:space="preserve">We used the CCHS 2017-2018 Public Use Microdata File to estimate whether the association between BMI category and cardiometabolic multimorbidity differs between women and men, on both the multiplicative and the additive scale, overall and by age group. The analysis is descriptive and reports associations; it does not estimate causal effects.</w:t>
+        <w:t xml:space="preserve">I used the CCHS 2017-2018 Public Use Microdata File to estimate whether the association between BMI category and cardiometabolic multimorbidity differs between women and men, on both the multiplicative and the additive scale, overall and by age group. The analysis is descriptive and reports associations; it does not estimate causal effects.</w:t>
       </w:r>
     </w:p>
     <w:p>
@@ -332,7 +332,7 @@
           <w:szCs w:val="21"/>
           <w:color w:val="000000"/>
         </w:rPr>
-        <w:t xml:space="preserve">The CCHS is a cross-sectional survey of the household population aged 12 and older in Canada, conducted by Statistics Canada. We used the 2017-2018 Annual Component Public Use Microdata File (PUMF), which includes 113,290 respondents and 1,000 bootstrap replicate weights [22]. This cycle was chosen because later PUMFs (2019-2020 and 2022) group BMI into two categories, do not separate heart disease from stroke, and collected physical activity from a minority of respondents. We included adults aged 18 and older and excluded those currently pregnant, for whom BMI is not derived (25), giving 104,611 adults (supplementary flow diagram).</w:t>
+        <w:t xml:space="preserve">The CCHS is a cross-sectional survey of the household population aged 12 and older in Canada, conducted by Statistics Canada. I used the 2017-2018 Annual Component Public Use Microdata File (PUMF), which includes 113,290 respondents and 1,000 bootstrap replicate weights [22]. This cycle was chosen because later PUMFs (2019-2020 and 2022) group BMI into two categories, do not separate heart disease from stroke, and collected physical activity from a minority of respondents. I included adults aged 18 and older and excluded those currently pregnant, for whom BMI is not derived (25), giving 104,611 adults (supplementary flow diagram).</w:t>
       </w:r>
     </w:p>
     <w:p>
@@ -422,7 +422,7 @@
           <w:szCs w:val="21"/>
           <w:color w:val="000000"/>
         </w:rPr>
-        <w:t xml:space="preserve">Of the 104,611 adults, 91,978 (87.9%) had complete data. BMI was missing for 4.6% of men and 7.8% of women, partly because height and weight were not asked in proxy interviews (n = 2,644). We used multiple imputation by chained equations [16] with 20 imputations, run separately within each sex and age group (18-44, 45-64, 65+) so that associations that differ by sex and age were preserved. Continuous adjusted BMI was imputed by predictive mean matching, and BMI categories and multimorbidity were derived from the imputed values. Estimates were combined with Rubin's rules.</w:t>
+        <w:t xml:space="preserve">Of the 104,611 adults, 91,978 (87.9%) had complete data. BMI was missing for 4.6% of men and 7.8% of women, partly because height and weight were not asked in proxy interviews (n = 2,644). I used multiple imputation by chained equations [16] with 20 imputations, run separately within each sex and age group (18-44, 45-64, 65+) so that associations that differ by sex and age were preserved. Continuous adjusted BMI was imputed by predictive mean matching, and BMI categories and multimorbidity were derived from the imputed values. Estimates were combined with Rubin's rules.</w:t>
       </w:r>
     </w:p>
     <w:p>
@@ -467,7 +467,7 @@
           <w:szCs w:val="21"/>
           <w:color w:val="000000"/>
         </w:rPr>
-        <w:t xml:space="preserve">All estimates used the survey weights. Variance was estimated with the PUMF bootstrap replicate weights, with each imputation's bootstrap variance used as the within-imputation variance. We fitted logistic regression for each outcome with main effects for BMI category and sex and then with a sex by BMI category product term, adjusted for the covariates listed above. Estimates were checked against the survey package in R [17]. We report odds ratios for each BMI category against normal weight within each sex, and their ratio (women over men) as the measure of multiplicative interaction. The global interaction test was a pooled Wald test of the three product terms [18], with Holm adjustment across the four outcomes; category-specific ratios carry Benjamini-Hochberg q-values.</w:t>
+        <w:t xml:space="preserve">All estimates used the survey weights. Variance was estimated with the PUMF bootstrap replicate weights, with each imputation's bootstrap variance used as the within-imputation variance. I fitted logistic regression for each outcome with main effects for BMI category and sex and then with a sex by BMI category product term, adjusted for the covariates listed above. Estimates were checked against the survey package in R [17]. I report odds ratios for each BMI category against normal weight within each sex, and their ratio (women over men) as the measure of multiplicative interaction. The global interaction test was a pooled Wald test of the three product terms [18], with Holm adjustment across the four outcomes; category-specific ratios carry Benjamini-Hochberg q-values.</w:t>
       </w:r>
     </w:p>
     <w:p>
@@ -485,7 +485,7 @@
           <w:szCs w:val="21"/>
           <w:color w:val="000000"/>
         </w:rPr>
-        <w:t xml:space="preserve">Additive interaction was estimated in two ways. First, on the odds ratio scale, we calculated the RERI, attributable proportion (AP) and synergy index (SI), using normal-weight women, the lowest-risk group, as the reference so that the second exposure is male sex [19]. Second, because odds ratios approximate risk ratios poorly for common outcomes, we estimated model-standardized prevalence: predicted probabilities for each sex and BMI category were averaged over the survey-weighted covariate distribution of the whole cohort. The BMI-associated prevalence difference was calculated within each sex, and the difference between women and men is the interaction contrast on the probability scale. For both approaches, variance was obtained by repeating the calculation on each of the 1,000 bootstrap replicates within each imputation and pooling across imputations.</w:t>
+        <w:t xml:space="preserve">Additive interaction was estimated in two ways. First, on the odds ratio scale, I calculated the RERI, attributable proportion (AP) and synergy index (SI), using normal-weight women, the lowest-risk group, as the reference so that the second exposure is male sex [19]. Second, because odds ratios approximate risk ratios poorly for common outcomes, I estimated model-standardized prevalence: predicted probabilities for each sex and BMI category were averaged over the survey-weighted covariate distribution of the whole cohort. The BMI-associated prevalence difference was calculated within each sex, and the difference between women and men is the interaction contrast on the probability scale. For both approaches, variance was obtained by repeating the calculation on each of the 1,000 bootstrap replicates within each imputation and pooling across imputations.</w:t>
       </w:r>
     </w:p>
     <w:p>
@@ -503,7 +503,7 @@
           <w:szCs w:val="21"/>
           <w:color w:val="000000"/>
         </w:rPr>
-        <w:t xml:space="preserve">We repeated the analysis within age groups (18-44, 45-64, 65+), excluding underweight adults, and conducted sensitivity analyses using complete cases, self-reported (unadjusted) BMI, obesity split into class I (30.0 to 34.9) and class II-III (35.0 or above), excluding underweight adults, and propensity score weighting for BMI category within each sex, with and without covariate adjustment in the outcome model. We calculated E-values for the sex-specific odds ratios [20]. Estimates based on fewer than 30 unweighted cases were not interpreted, following Statistics Canada release guidelines. Underweight results are shown but not interpreted because multimorbidity among underweight adults rested on 13 cases in men. Reporting follows STROBE [21]. Analyses used R 4.4.2 with the survey, mice, WeightIt, cobalt and EValue packages; code is publicly available.</w:t>
+        <w:t xml:space="preserve">I repeated the analysis within age groups (18-44, 45-64, 65+), excluding underweight adults, and conducted sensitivity analyses using complete cases, self-reported (unadjusted) BMI, obesity split into class I (30.0 to 34.9) and class II-III (35.0 or above), excluding underweight adults, and propensity score weighting for BMI category within each sex, with and without covariate adjustment in the outcome model. I calculated E-values for the sex-specific odds ratios [20]. Estimates based on fewer than 30 unweighted cases were not interpreted, following Statistics Canada release guidelines. Underweight results are shown but not interpreted because multimorbidity among underweight adults rested on 13 cases in men. Reporting follows STROBE [21]. Analyses used R 4.4.2 with the survey, mice, WeightIt, cobalt and EValue packages; code is publicly available.</w:t>
       </w:r>
     </w:p>
     <w:p>
@@ -17060,7 +17060,7 @@
           <w:szCs w:val="21"/>
           <w:color w:val="000000"/>
         </w:rPr>
-        <w:t xml:space="preserve">The sex difference on the absolute scale held with complete cases, with unadjusted self-reported BMI and with covariate-adjusted propensity score weighting. It was attenuated when the sexes were compared each at their own covariate distribution without adjustment, which indicates that part of the difference depends on comparing women and men at a common covariate profile, for example the same age distribution. Previous CCHS work found a more than additive joint association of obesity and female sex for arthritis [12], the opposite direction to our finding for cardiometabolic multimorbidity, which suggests that the sex pattern of obesity-associated excess burden differs between chronic conditions.</w:t>
+        <w:t xml:space="preserve">The sex difference on the absolute scale held with complete cases, with unadjusted self-reported BMI and with covariate-adjusted propensity score weighting. It was attenuated when the sexes were compared each at their own covariate distribution without adjustment, which indicates that part of the difference depends on comparing women and men at a common covariate profile, for example the same age distribution. Previous CCHS work found a more than additive joint association of obesity and female sex for arthritis [12], the opposite direction to the finding here for cardiometabolic multimorbidity, which suggests that the sex pattern of obesity-associated excess burden differs between chronic conditions.</w:t>
       </w:r>
     </w:p>
     <w:p>
@@ -17213,7 +17213,7 @@
           <w:szCs w:val="21"/>
           <w:color w:val="000000"/>
         </w:rPr>
-        <w:t xml:space="preserve">Funding: [to be confirmed by author]</w:t>
+        <w:t xml:space="preserve">Funding: This research received no funding.</w:t>
       </w:r>
     </w:p>
     <w:p>
@@ -17231,7 +17231,7 @@
           <w:szCs w:val="21"/>
           <w:color w:val="000000"/>
         </w:rPr>
-        <w:t xml:space="preserve">Competing interests: [to be confirmed by author]</w:t>
+        <w:t xml:space="preserve">Competing interests: The author declares no competing interests.</w:t>
       </w:r>
     </w:p>
     <w:p>

</xml_diff>